<commit_message>
Update Ledger v01.09.03 conformance fixes
</commit_message>
<xml_diff>
--- a/NC25OL Specification v01.09.docx
+++ b/NC25OL Specification v01.09.docx
@@ -13416,7 +13416,15 @@
         <w:pStyle w:val="ListBullet"/>
       </w:pPr>
       <w:r>
-        <w:t>Every public SDK operation requires an explicit actor_scope; omission fails closed, no method supplies its required role as a default, and production derives the scope from verified workload identity.</w:t>
+        <w:t>Every public SDK operation requires an explicit actor_scope; omission fails closed, no method supplies its required role as a default, and production derives the scope from verified workload identity. Identifier, version, hash and role arguments require native Python str values so caller-defined equality cannot impersonate an actor.</w:t>
+      </w:r>
+    </w:p>
+    <w:p>
+      <w:pPr>
+        <w:pStyle w:val="ListBullet"/>
+      </w:pPr>
+      <w:r>
+        <w:t>Post-authorization resolver failures produce recorded REFUSAL/EXECUTION_DENIED with the submitted request hash and a consumed idempotency key. The architect decision names AUTHORITATIVE_RESOLUTION_FAILED; an exact retry preserves that refusal.</w:t>
       </w:r>
     </w:p>
     <w:p>
@@ -13504,7 +13512,7 @@
         <w:pStyle w:val="ListBullet"/>
       </w:pPr>
       <w:r>
-        <w:t>A reference WSGI adapter (sdk/python/nc25_universal_adapter.py) implements every route and validates each POST body against the packaged JSON Schemas with pinned jsonschema before calling the engine. It derives the route scope from the transport identity and never the body, binds the posted activation profile and declaration to the engine's sealed hashes, requires the Idempotency-Key header to equal intent.idempotency_key, binds the path permit hash to the body, and maps engine outcomes to the declared HTTP statuses. The engine's default paths are standard-library only; the optional Ed25519 signers require the pinned cryptography wheel and fail closed without it. Production replaces the scope header with mTLS plus scoped OAuth.</w:t>
+        <w:t>A reference WSGI adapter (sdk/python/nc25_universal_adapter.py) implements every route and validates each POST body against the packaged JSON Schemas with pinned jsonschema before calling the engine. It reads the reference X-Workload-Scope header rather than the body; that header does not authenticate a principal. Production derives role and requester from verified workload identity. It binds the posted activation profile and declaration to the engine's sealed hashes, requires the Idempotency-Key header to equal intent.idempotency_key, binds the path permit hash to the body, and maps engine outcomes to the declared HTTP statuses. The engine's default paths are standard-library only; the optional Ed25519 signers require the pinned cryptography wheel and fail closed without it. Production replaces the scope header with mTLS plus scoped OAuth.</w:t>
       </w:r>
     </w:p>
     <w:p>
@@ -13921,7 +13929,7 @@
                 <w:color w:val="000000"/>
                 <w:sz w:val="15"/>
               </w:rPr>
-              <w:t>Malformed evidence object, hash, reference, or unknown status</w:t>
+              <w:t>Malformed submitted evidence object, hash, reference, or unknown status</w:t>
             </w:r>
           </w:p>
         </w:tc>
@@ -13976,6 +13984,119 @@
                 <w:sz w:val="15"/>
               </w:rPr>
               <w:t>No decision</w:t>
+            </w:r>
+          </w:p>
+        </w:tc>
+        <w:tc>
+          <w:tcPr>
+            <w:tcW w:type="dxa" w:w="1460"/>
+            <w:vAlign w:val="center"/>
+            <w:tcMar>
+              <w:top w:w="80" w:type="dxa"/>
+              <w:start w:w="120" w:type="dxa"/>
+              <w:bottom w:w="80" w:type="dxa"/>
+              <w:end w:w="120" w:type="dxa"/>
+            </w:tcMar>
+          </w:tcPr>
+          <w:p>
+            <w:pPr>
+              <w:spacing w:after="0" w:before="0"/>
+            </w:pPr>
+            <w:r/>
+            <w:r>
+              <w:rPr>
+                <w:rFonts w:ascii="Calibri" w:hAnsi="Calibri"/>
+                <w:b w:val="0"/>
+                <w:color w:val="000000"/>
+                <w:sz w:val="15"/>
+              </w:rPr>
+              <w:t>None</w:t>
+            </w:r>
+          </w:p>
+        </w:tc>
+      </w:tr>
+      <w:tr>
+        <w:trPr>
+          <w:cantSplit/>
+        </w:trPr>
+        <w:tc>
+          <w:tcPr>
+            <w:tcW w:type="dxa" w:w="3600"/>
+            <w:vAlign w:val="center"/>
+            <w:tcMar>
+              <w:top w:w="80" w:type="dxa"/>
+              <w:start w:w="120" w:type="dxa"/>
+              <w:bottom w:w="80" w:type="dxa"/>
+              <w:end w:w="120" w:type="dxa"/>
+            </w:tcMar>
+          </w:tcPr>
+          <w:p>
+            <w:pPr>
+              <w:spacing w:after="0" w:before="0"/>
+            </w:pPr>
+            <w:r/>
+            <w:r>
+              <w:rPr>
+                <w:rFonts w:ascii="Calibri" w:hAnsi="Calibri"/>
+                <w:b w:val="0"/>
+                <w:color w:val="000000"/>
+                <w:sz w:val="15"/>
+              </w:rPr>
+              <w:t>Resolver failure or malformed/future authoritative output</w:t>
+            </w:r>
+          </w:p>
+        </w:tc>
+        <w:tc>
+          <w:tcPr>
+            <w:tcW w:type="dxa" w:w="2250"/>
+            <w:vAlign w:val="center"/>
+            <w:tcMar>
+              <w:top w:w="80" w:type="dxa"/>
+              <w:start w:w="120" w:type="dxa"/>
+              <w:bottom w:w="80" w:type="dxa"/>
+              <w:end w:w="120" w:type="dxa"/>
+            </w:tcMar>
+          </w:tcPr>
+          <w:p>
+            <w:pPr>
+              <w:spacing w:after="0" w:before="0"/>
+            </w:pPr>
+            <w:r/>
+            <w:r>
+              <w:rPr>
+                <w:rFonts w:ascii="Calibri" w:hAnsi="Calibri"/>
+                <w:b w:val="0"/>
+                <w:color w:val="000000"/>
+                <w:sz w:val="15"/>
+              </w:rPr>
+              <w:t>REFUSAL</w:t>
+            </w:r>
+          </w:p>
+        </w:tc>
+        <w:tc>
+          <w:tcPr>
+            <w:tcW w:type="dxa" w:w="2050"/>
+            <w:vAlign w:val="center"/>
+            <w:tcMar>
+              <w:top w:w="80" w:type="dxa"/>
+              <w:start w:w="120" w:type="dxa"/>
+              <w:bottom w:w="80" w:type="dxa"/>
+              <w:end w:w="120" w:type="dxa"/>
+            </w:tcMar>
+          </w:tcPr>
+          <w:p>
+            <w:pPr>
+              <w:spacing w:after="0" w:before="0"/>
+            </w:pPr>
+            <w:r/>
+            <w:r>
+              <w:rPr>
+                <w:rFonts w:ascii="Calibri" w:hAnsi="Calibri"/>
+                <w:b w:val="0"/>
+                <w:color w:val="000000"/>
+                <w:sz w:val="15"/>
+              </w:rPr>
+              <w:t>No</w:t>
             </w:r>
           </w:p>
         </w:tc>
@@ -17235,7 +17356,7 @@
                 <w:color w:val="000000"/>
                 <w:sz w:val="17"/>
               </w:rPr>
-              <w:t>34 positive and negative state-machine tests, each run against all three shipped profiles</w:t>
+              <w:t>36 positive and negative state-machine tests, each run against all three shipped profiles</w:t>
             </w:r>
           </w:p>
         </w:tc>
@@ -17579,7 +17700,7 @@
                 <w:color w:val="000000"/>
                 <w:sz w:val="17"/>
               </w:rPr>
-              <w:t>89 focused tests derived from the executable suite</w:t>
+              <w:t>99 focused tests derived from the executable suite</w:t>
             </w:r>
           </w:p>
         </w:tc>
@@ -17665,7 +17786,7 @@
                 <w:color w:val="000000"/>
                 <w:sz w:val="17"/>
               </w:rPr>
-              <w:t>68 tests over the permit-gated append seam, including every declared refusal code of its own vocabulary</w:t>
+              <w:t>71 tests over the permit-gated append seam, including every declared refusal code of its own vocabulary</w:t>
             </w:r>
           </w:p>
         </w:tc>

</xml_diff>